<commit_message>
docs: pdf & docs of architecture doc updated
</commit_message>
<xml_diff>
--- a/Documentation/document_architecture_livrai.docx
+++ b/Documentation/document_architecture_livrai.docx
@@ -678,7 +678,7 @@
               <w:rPr>
                 <w:noProof/>
               </w:rPr>
-              <w:t>4</w:t>
+              <w:t>5</w:t>
             </w:r>
             <w:r>
               <w:rPr>
@@ -739,7 +739,7 @@
               <w:rPr>
                 <w:noProof/>
               </w:rPr>
-              <w:t>4</w:t>
+              <w:t>5</w:t>
             </w:r>
             <w:r>
               <w:rPr>
@@ -800,7 +800,7 @@
               <w:rPr>
                 <w:noProof/>
               </w:rPr>
-              <w:t>4</w:t>
+              <w:t>5</w:t>
             </w:r>
             <w:r>
               <w:rPr>
@@ -826,7 +826,21 @@
                 <w:rStyle w:val="Lienhypertexte"/>
                 <w:noProof/>
               </w:rPr>
-              <w:t>3.3 Authentification — JWT</w:t>
+              <w:t>3.3 Authentification</w:t>
+            </w:r>
+            <w:r>
+              <w:rPr>
+                <w:rStyle w:val="Lienhypertexte"/>
+                <w:noProof/>
+              </w:rPr>
+              <w:t xml:space="preserve"> </w:t>
+            </w:r>
+            <w:r>
+              <w:rPr>
+                <w:rStyle w:val="Lienhypertexte"/>
+                <w:noProof/>
+              </w:rPr>
+              <w:t>JWT</w:t>
             </w:r>
             <w:r>
               <w:rPr>
@@ -861,7 +875,7 @@
               <w:rPr>
                 <w:noProof/>
               </w:rPr>
-              <w:t>5</w:t>
+              <w:t>6</w:t>
             </w:r>
             <w:r>
               <w:rPr>
@@ -922,7 +936,7 @@
               <w:rPr>
                 <w:noProof/>
               </w:rPr>
-              <w:t>5</w:t>
+              <w:t>7</w:t>
             </w:r>
             <w:r>
               <w:rPr>
@@ -983,7 +997,7 @@
               <w:rPr>
                 <w:noProof/>
               </w:rPr>
-              <w:t>5</w:t>
+              <w:t>7</w:t>
             </w:r>
             <w:r>
               <w:rPr>
@@ -1044,7 +1058,7 @@
               <w:rPr>
                 <w:noProof/>
               </w:rPr>
-              <w:t>6</w:t>
+              <w:t>7</w:t>
             </w:r>
             <w:r>
               <w:rPr>
@@ -1105,7 +1119,7 @@
               <w:rPr>
                 <w:noProof/>
               </w:rPr>
-              <w:t>6</w:t>
+              <w:t>8</w:t>
             </w:r>
             <w:r>
               <w:rPr>
@@ -1166,7 +1180,7 @@
               <w:rPr>
                 <w:noProof/>
               </w:rPr>
-              <w:t>6</w:t>
+              <w:t>10</w:t>
             </w:r>
             <w:r>
               <w:rPr>
@@ -1227,7 +1241,7 @@
               <w:rPr>
                 <w:noProof/>
               </w:rPr>
-              <w:t>7</w:t>
+              <w:t>10</w:t>
             </w:r>
             <w:r>
               <w:rPr>
@@ -1288,7 +1302,7 @@
               <w:rPr>
                 <w:noProof/>
               </w:rPr>
-              <w:t>7</w:t>
+              <w:t>10</w:t>
             </w:r>
             <w:r>
               <w:rPr>
@@ -1349,7 +1363,7 @@
               <w:rPr>
                 <w:noProof/>
               </w:rPr>
-              <w:t>7</w:t>
+              <w:t>10</w:t>
             </w:r>
             <w:r>
               <w:rPr>
@@ -1410,7 +1424,7 @@
               <w:rPr>
                 <w:noProof/>
               </w:rPr>
-              <w:t>7</w:t>
+              <w:t>10</w:t>
             </w:r>
             <w:r>
               <w:rPr>
@@ -1471,7 +1485,7 @@
               <w:rPr>
                 <w:noProof/>
               </w:rPr>
-              <w:t>9</w:t>
+              <w:t>12</w:t>
             </w:r>
             <w:r>
               <w:rPr>
@@ -1532,7 +1546,7 @@
               <w:rPr>
                 <w:noProof/>
               </w:rPr>
-              <w:t>9</w:t>
+              <w:t>12</w:t>
             </w:r>
             <w:r>
               <w:rPr>
@@ -1593,7 +1607,7 @@
               <w:rPr>
                 <w:noProof/>
               </w:rPr>
-              <w:t>9</w:t>
+              <w:t>12</w:t>
             </w:r>
             <w:r>
               <w:rPr>
@@ -1654,7 +1668,7 @@
               <w:rPr>
                 <w:noProof/>
               </w:rPr>
-              <w:t>9</w:t>
+              <w:t>12</w:t>
             </w:r>
             <w:r>
               <w:rPr>
@@ -1715,7 +1729,7 @@
               <w:rPr>
                 <w:noProof/>
               </w:rPr>
-              <w:t>9</w:t>
+              <w:t>12</w:t>
             </w:r>
             <w:r>
               <w:rPr>
@@ -1776,7 +1790,7 @@
               <w:rPr>
                 <w:noProof/>
               </w:rPr>
-              <w:t>9</w:t>
+              <w:t>13</w:t>
             </w:r>
             <w:r>
               <w:rPr>
@@ -1837,7 +1851,7 @@
               <w:rPr>
                 <w:noProof/>
               </w:rPr>
-              <w:t>10</w:t>
+              <w:t>13</w:t>
             </w:r>
             <w:r>
               <w:rPr>
@@ -1898,7 +1912,7 @@
               <w:rPr>
                 <w:noProof/>
               </w:rPr>
-              <w:t>10</w:t>
+              <w:t>13</w:t>
             </w:r>
             <w:r>
               <w:rPr>
@@ -1959,7 +1973,7 @@
               <w:rPr>
                 <w:noProof/>
               </w:rPr>
-              <w:t>10</w:t>
+              <w:t>13</w:t>
             </w:r>
             <w:r>
               <w:rPr>
@@ -2020,7 +2034,7 @@
               <w:rPr>
                 <w:noProof/>
               </w:rPr>
-              <w:t>10</w:t>
+              <w:t>14</w:t>
             </w:r>
             <w:r>
               <w:rPr>
@@ -2081,7 +2095,7 @@
               <w:rPr>
                 <w:noProof/>
               </w:rPr>
-              <w:t>11</w:t>
+              <w:t>14</w:t>
             </w:r>
             <w:r>
               <w:rPr>
@@ -2142,7 +2156,7 @@
               <w:rPr>
                 <w:noProof/>
               </w:rPr>
-              <w:t>11</w:t>
+              <w:t>14</w:t>
             </w:r>
             <w:r>
               <w:rPr>
@@ -2203,7 +2217,7 @@
               <w:rPr>
                 <w:noProof/>
               </w:rPr>
-              <w:t>11</w:t>
+              <w:t>14</w:t>
             </w:r>
             <w:r>
               <w:rPr>

</xml_diff>